<commit_message>
feat(outbox): doi soat idempotent don da ky thieu Task gui (A2/F11)
Them reconcilePrescriptions quet List 'prescription' thieu Task 'send-prescription' (khoang trong ghi kep A2) va tao lai Task qua createResourceIfNoneExist theo ma don (idempotent). Route POST /api/prescriptions/reconcile (CLINICAL_ROLES, nhat ky prescription-reconcile khong PII), nut 'Quet doi soat' tren Gateway.tsx. Giu nhan CONG QUOC GIA: MO PHONG, khong doi hanh vi gui.

Test dot bien reconcile.test.ts (da quan sat DO khi vo hieu hoa doi soat) + test tich hop A2 tren Medplum that. Cap nhat trang-thai-chuc-nang (.md/.docx) va Scope.tsx.
</commit_message>
<xml_diff>
--- a/trang-thai-chuc-nang.docx
+++ b/trang-thai-chuc-nang.docx
@@ -2062,33 +2062,33 @@
               <w:rPr>
                 <w:rFonts w:ascii="Calibri" w:hAnsi="Calibri"/>
               </w:rPr>
-              <w:t>🔧</w:t>
-            </w:r>
-          </w:p>
-        </w:tc>
-        <w:tc>
-          <w:tcPr>
-            <w:tcW w:type="dxa" w:w="2160"/>
-          </w:tcPr>
-          <w:p>
-            <w:r>
-              <w:rPr>
-                <w:rFonts w:ascii="Calibri" w:hAnsi="Calibri"/>
-              </w:rPr>
-              <w:t>M1 (S2)</w:t>
-            </w:r>
-          </w:p>
-        </w:tc>
-        <w:tc>
-          <w:tcPr>
-            <w:tcW w:type="dxa" w:w="2160"/>
-          </w:tcPr>
-          <w:p>
-            <w:r>
-              <w:rPr>
-                <w:rFonts w:ascii="Calibri" w:hAnsi="Calibri"/>
-              </w:rPr>
-              <w:t>M0 có outbox + thử lại; đối soát đầy đủ ở T-OUTBOX</w:t>
+              <w:t>✅</w:t>
+            </w:r>
+          </w:p>
+        </w:tc>
+        <w:tc>
+          <w:tcPr>
+            <w:tcW w:type="dxa" w:w="2160"/>
+          </w:tcPr>
+          <w:p>
+            <w:r>
+              <w:rPr>
+                <w:rFonts w:ascii="Calibri" w:hAnsi="Calibri"/>
+              </w:rPr>
+              <w:t>M0</w:t>
+            </w:r>
+          </w:p>
+        </w:tc>
+        <w:tc>
+          <w:tcPr>
+            <w:tcW w:type="dxa" w:w="2160"/>
+          </w:tcPr>
+          <w:p>
+            <w:r>
+              <w:rPr>
+                <w:rFonts w:ascii="Calibri" w:hAnsi="Calibri"/>
+              </w:rPr>
+              <w:t>medplum.ts reconcilePrescriptions quét List prescription thiếu Task send-prescription (khoảng trống ghi kép A2/F11) rồi tạo lại Task qua createResourceIfNoneExist theo mã đơn (idempotent); route POST /api/prescriptions/reconcile (routes/clinical.ts, CLINICAL_ROLES, nhật ký prescription-reconcile không PII); nút "Quét đối soát" ở components/Gateway.tsx; test đột biến test/unit/reconcile.test.ts (đã quan sát ĐỎ) + tích hợp test/integration/clinical.test.ts (A2)</w:t>
             </w:r>
           </w:p>
         </w:tc>
@@ -2398,7 +2398,7 @@
               <w:rPr>
                 <w:rFonts w:ascii="Calibri" w:hAnsi="Calibri"/>
               </w:rPr>
-              <w:t>Phát hiện &amp; báo xung đột sửa đồng thời + chạy lại quy tắc khi đồng bộ</w:t>
+              <w:t>Phát hiện, báo &amp; xử lý tay xung đột sửa đồng thời + chạy lại quy tắc khi đồng bộ</w:t>
             </w:r>
           </w:p>
         </w:tc>
@@ -2424,20 +2424,20 @@
               <w:rPr>
                 <w:rFonts w:ascii="Calibri" w:hAnsi="Calibri"/>
               </w:rPr>
-              <w:t>M0 (phát hiện) → GĐ2 (giải quyết)</w:t>
-            </w:r>
-          </w:p>
-        </w:tc>
-        <w:tc>
-          <w:tcPr>
-            <w:tcW w:type="dxa" w:w="2160"/>
-          </w:tcPr>
-          <w:p>
-            <w:r>
-              <w:rPr>
-                <w:rFonts w:ascii="Calibri" w:hAnsi="Calibri"/>
-              </w:rPr>
-              <w:t>local/deps.ts needsAttention (conflict/rules/error → held, không tự bỏ/ghi đè, N3); OfflineSignResult.tsx hiện xung đột/cần xác nhận. M0 chỉ phát hiện và báo, chưa đưa bản khám lên máy chủ</w:t>
+              <w:t>M0 (phát hiện + xử lý tay) → GĐ2 (hợp nhất tự động)</w:t>
+            </w:r>
+          </w:p>
+        </w:tc>
+        <w:tc>
+          <w:tcPr>
+            <w:tcW w:type="dxa" w:w="2160"/>
+          </w:tcPr>
+          <w:p>
+            <w:r>
+              <w:rPr>
+                <w:rFonts w:ascii="Calibri" w:hAnsi="Calibri"/>
+              </w:rPr>
+              <w:t>local/deps.ts needsAttention (conflict/rules/error → held, không tự bỏ/ghi đè, N3). Xử lý tay (M0): 422 xác nhận lý do gửi lại (syncActions.ts acknowledge); xung đột 409/lỗi dữ liệu xem chi tiết lý do, in lại đơn đã lưu (reprint qua whileLocalStoreQuiet), và đánh dấu "đã xử lý" để mục rời danh sách (syncActions.ts markHandled → sync.ts resolveByUser → trạng thái resolved, có xác nhận hai nhịp ở SyncPanel.tsx, KHÔNG gửi/ghi đè máy chủ). GĐ2: hợp nhất/đưa bản khám lên máy chủ tự động</w:t>
             </w:r>
           </w:p>
         </w:tc>

</xml_diff>

<commit_message>
docs: cập nhật trạng thái dự án theo main ae1f908 và prompt kế tiếp (M0-S3.5c)
- README: đoạn trạng thái (chức năng M0 đủ, T-IDP, M0-2/T6 xanh, việc còn lại),
  seed Docker 300 bệnh nhân, số bước e2e 13+26+16+14, nút "Đánh dấu đã xử lý",
  lỗi đã biết còn trên main (bản sửa PR #7, #9 nằm ngoài main), tìm kiếm P2.
- Kế hoạch: đầu tài liệu, mục 5.9 (bảng thêm OFF-8, tự thoát "Mất mạng",
  xử lý tay, demo Docker; M0-2 với số lần CI xanh; M0-6 treo; đoạn
  "Từ 04/10 đến 17/10/2026" với số CI của ae1f908), giới hạn (a), tiêu đề OFF-8,
  T-OUTBOX. Sửa ngày ghi nhầm (T6 13/11 -> 13/10; T-QUOTA 04/2026 -> 10/2026)
  và ghi rõ vế "40 ca trong 60 giây" của T6 chưa đo đúng nghĩa.
- Bảng chức năng: xác thực nhân viên thật ✅ (T-IDP), OTP SMS mô phỏng,
  hạn mức FHIR 🔧; sinh lại .docx.
- Sổ prompt: thêm PR #20, #26; sửa commit của P2; bỏ T6 khỏi việc còn treo;
  prompt M0-S3.5c (đưa hai bản sửa của lát 5 về main) và ứng viên kế tiếp.
</commit_message>
<xml_diff>
--- a/trang-thai-chuc-nang.docx
+++ b/trang-thai-chuc-nang.docx
@@ -32,6 +32,27 @@
       </w:pPr>
       <w:r>
         <w:t>không chỉ chép lại từ tài liệu. Bất biến "web không import @medplum/*" đã kiểm: 0 import trong apps/clinic-web/src.</w:t>
+      </w:r>
+    </w:p>
+    <w:p>
+      <w:pPr>
+        <w:pStyle w:val="IntenseQuote"/>
+      </w:pPr>
+    </w:p>
+    <w:p>
+      <w:pPr>
+        <w:pStyle w:val="IntenseQuote"/>
+      </w:pPr>
+      <w:r>
+        <w:t>Cập nhật 17/10/2026 theo commit ae1f908: dòng xác thực nhân viên, OTP qua SMS và hạn mức FHIR đã đối chiếu lại với mã ở</w:t>
+      </w:r>
+    </w:p>
+    <w:p>
+      <w:pPr>
+        <w:pStyle w:val="IntenseQuote"/>
+      </w:pPr>
+      <w:r>
+        <w:t>commit đó (T-IDP ở PR #26, T-QUOTA ở PR #25). Các dòng khác giữ kết quả xác minh ngày 13/10.</w:t>
       </w:r>
     </w:p>
     <w:p>
@@ -3404,33 +3425,87 @@
               <w:rPr>
                 <w:rFonts w:ascii="Calibri" w:hAnsi="Calibri"/>
               </w:rPr>
-              <w:t>⬜</w:t>
-            </w:r>
-          </w:p>
-        </w:tc>
-        <w:tc>
-          <w:tcPr>
-            <w:tcW w:type="dxa" w:w="2160"/>
-          </w:tcPr>
-          <w:p>
-            <w:r>
-              <w:rPr>
-                <w:rFonts w:ascii="Calibri" w:hAnsi="Calibri"/>
-              </w:rPr>
-              <w:t>M1</w:t>
-            </w:r>
-          </w:p>
-        </w:tc>
-        <w:tc>
-          <w:tcPr>
-            <w:tcW w:type="dxa" w:w="2160"/>
-          </w:tcPr>
-          <w:p>
-            <w:r>
-              <w:rPr>
-                <w:rFonts w:ascii="Calibri" w:hAnsi="Calibri"/>
-              </w:rPr>
-              <w:t>Hiện chỉ DEMO_AUTH=1, localhost, dữ liệu giả. Đăng nhập demo chọn người dùng, chưa có mật khẩu/MFA (components/Login.tsx, có nhãn ở Scope.tsx nhóm "mô phỏng"). Xác thực thật = T-IDP</w:t>
+              <w:t>✅</w:t>
+            </w:r>
+          </w:p>
+        </w:tc>
+        <w:tc>
+          <w:tcPr>
+            <w:tcW w:type="dxa" w:w="2160"/>
+          </w:tcPr>
+          <w:p>
+            <w:r>
+              <w:rPr>
+                <w:rFonts w:ascii="Calibri" w:hAnsi="Calibri"/>
+              </w:rPr>
+              <w:t>M0</w:t>
+            </w:r>
+          </w:p>
+        </w:tc>
+        <w:tc>
+          <w:tcPr>
+            <w:tcW w:type="dxa" w:w="2160"/>
+          </w:tcPr>
+          <w:p>
+            <w:r>
+              <w:rPr>
+                <w:rFonts w:ascii="Calibri" w:hAnsi="Calibri"/>
+              </w:rPr>
+              <w:t>T-IDP, PR #26 (Phương án B: IdP tối giản nhúng trong BFF). AUTH_MODE=real hoặc demo, không có mặc định (services/bff/src/config.ts). Mật khẩu Argon2id (identity/crypto.ts), TOTP bắt buộc cho chủ phòng khám và bác sĩ (identity/totp.ts, MFA_REQUIRED_ROLES), kho phiên và refresh xoay-một-lần trên SQLite (sessionStore.ts SqliteSessionStore); màn components/Login.tsx. Chế độ demo (chọn người dùng, không mật khẩu, chỉ localhost) giữ cho dev, e2e và buổi thử. IdP OIDC tách rời: M1</w:t>
+            </w:r>
+          </w:p>
+        </w:tc>
+      </w:tr>
+      <w:tr>
+        <w:tc>
+          <w:tcPr>
+            <w:tcW w:type="dxa" w:w="2160"/>
+          </w:tcPr>
+          <w:p>
+            <w:r>
+              <w:rPr>
+                <w:rFonts w:ascii="Calibri" w:hAnsi="Calibri"/>
+              </w:rPr>
+              <w:t>OTP qua SMS, thiết bị tin cậy</w:t>
+            </w:r>
+          </w:p>
+        </w:tc>
+        <w:tc>
+          <w:tcPr>
+            <w:tcW w:type="dxa" w:w="2160"/>
+          </w:tcPr>
+          <w:p>
+            <w:r>
+              <w:rPr>
+                <w:rFonts w:ascii="Calibri" w:hAnsi="Calibri"/>
+              </w:rPr>
+              <w:t>🟡</w:t>
+            </w:r>
+          </w:p>
+        </w:tc>
+        <w:tc>
+          <w:tcPr>
+            <w:tcW w:type="dxa" w:w="2160"/>
+          </w:tcPr>
+          <w:p>
+            <w:r>
+              <w:rPr>
+                <w:rFonts w:ascii="Calibri" w:hAnsi="Calibri"/>
+              </w:rPr>
+              <w:t>M0 → M1</w:t>
+            </w:r>
+          </w:p>
+        </w:tc>
+        <w:tc>
+          <w:tcPr>
+            <w:tcW w:type="dxa" w:w="2160"/>
+          </w:tcPr>
+          <w:p>
+            <w:r>
+              <w:rPr>
+                <w:rFonts w:ascii="Calibri" w:hAnsi="Calibri"/>
+              </w:rPr>
+              <w:t>identity/connectors.ts SimulatedSmsOtp: không gửi gì ra ngoài. Thiết bị tin cậy cũng mô phỏng có nhãn (README, mục "Giới hạn"). TOTP là MFA thật</w:t>
             </w:r>
           </w:p>
         </w:tc>
@@ -4023,33 +4098,33 @@
               <w:rPr>
                 <w:rFonts w:ascii="Calibri" w:hAnsi="Calibri"/>
               </w:rPr>
-              <w:t>⬜</w:t>
-            </w:r>
-          </w:p>
-        </w:tc>
-        <w:tc>
-          <w:tcPr>
-            <w:tcW w:type="dxa" w:w="2160"/>
-          </w:tcPr>
-          <w:p>
-            <w:r>
-              <w:rPr>
-                <w:rFonts w:ascii="Calibri" w:hAnsi="Calibri"/>
-              </w:rPr>
-              <w:t>M1</w:t>
-            </w:r>
-          </w:p>
-        </w:tc>
-        <w:tc>
-          <w:tcPr>
-            <w:tcW w:type="dxa" w:w="2160"/>
-          </w:tcPr>
-          <w:p>
-            <w:r>
-              <w:rPr>
-                <w:rFonts w:ascii="Calibri" w:hAnsi="Calibri"/>
-              </w:rPr>
-              <w:t>T-QUOTA (cần trước T6 100 chu kỳ)</w:t>
+              <w:t>🔧</w:t>
+            </w:r>
+          </w:p>
+        </w:tc>
+        <w:tc>
+          <w:tcPr>
+            <w:tcW w:type="dxa" w:w="2160"/>
+          </w:tcPr>
+          <w:p>
+            <w:r>
+              <w:rPr>
+                <w:rFonts w:ascii="Calibri" w:hAnsi="Calibri"/>
+              </w:rPr>
+              <w:t>M0 (phần T6) → M1</w:t>
+            </w:r>
+          </w:p>
+        </w:tc>
+        <w:tc>
+          <w:tcPr>
+            <w:tcW w:type="dxa" w:w="2160"/>
+          </w:tcPr>
+          <w:p>
+            <w:r>
+              <w:rPr>
+                <w:rFonts w:ascii="Calibri" w:hAnsi="Calibri"/>
+              </w:rPr>
+              <w:t>T-QUOTA, PR #25: phòng khám thử của e2e:cycles và buổi thử đặt userFhirQuota và totalFhirQuota = 1.000.000 điểm/phút (services/bff/scripts/e2e-clinic.ts, scripts/trial/clinic.ts); T6 100 chu kỳ chạy xanh, 0 kết quả 429. Còn lại M1: tài khoản nhập dữ liệu hạn mức cao, proxy chuyển IP thật cho hạn mức đăng nhập</w:t>
             </w:r>
           </w:p>
         </w:tc>
@@ -4538,7 +4613,15 @@
         <w:pStyle w:val="ListBullet"/>
       </w:pPr>
       <w:r>
-        <w:t>Còn phải làm để thành sản phẩm thật (M1 trở đi): xác thực thật (bỏ DEMO_AUTH), nối thật cổng</w:t>
+        <w:t>Xác thực nhân viên thật (mật khẩu + TOTP) đã có từ PR #26; OTP qua SMS và thiết bị tin cậy còn mô phỏng.</w:t>
+      </w:r>
+    </w:p>
+    <w:p>
+      <w:pPr>
+        <w:pStyle w:val="ListBullet"/>
+      </w:pPr>
+      <w:r>
+        <w:t>Còn phải làm để thành sản phẩm thật (M1 trở đi): nối thật cổng</w:t>
       </w:r>
     </w:p>
     <w:p>

</xml_diff>